<commit_message>
Organizing and Focusing on Python
</commit_message>
<xml_diff>
--- a/python/p1_python_programming_language.docx
+++ b/python/p1_python_programming_language.docx
@@ -36756,12 +36756,16 @@
         <w:spacing w:line="240" w:lineRule="auto"/>
         <w:jc w:val="both"/>
         <w:rPr>
-          <w:sz w:val="32"/>
-          <w:szCs w:val="32"/>
-        </w:rPr>
-      </w:pPr>
-      <w:r>
-        <w:rPr>
+          <w:b/>
+          <w:bCs/>
+          <w:sz w:val="32"/>
+          <w:szCs w:val="32"/>
+        </w:rPr>
+      </w:pPr>
+      <w:r>
+        <w:rPr>
+          <w:b/>
+          <w:bCs/>
           <w:sz w:val="32"/>
           <w:szCs w:val="32"/>
         </w:rPr>
@@ -37095,17 +37099,7 @@
           <w:sz w:val="32"/>
           <w:szCs w:val="32"/>
         </w:rPr>
-        <w:t xml:space="preserve">) </w:t>
-      </w:r>
-      <w:r>
-        <w:rPr>
-          <w:b/>
-          <w:bCs/>
-          <w:color w:val="D86DCB" w:themeColor="accent5" w:themeTint="99"/>
-          <w:sz w:val="32"/>
-          <w:szCs w:val="32"/>
-        </w:rPr>
-        <w:t># {'name': 'Nazmul', 'phone': '01991407207', 'email': 'email'}</w:t>
+        <w:t>) # {'name': 'Nazmul', 'phone': '01991407207', 'email': 'email'}</w:t>
       </w:r>
     </w:p>
     <w:p>
@@ -37151,119 +37145,56 @@
           <w:sz w:val="32"/>
           <w:szCs w:val="32"/>
         </w:rPr>
-        <w:t>))</w:t>
-      </w:r>
-      <w:r>
-        <w:rPr>
-          <w:b/>
-          <w:bCs/>
-          <w:color w:val="D86DCB" w:themeColor="accent5" w:themeTint="99"/>
+        <w:t>)) # &lt;class '</w:t>
+      </w:r>
+      <w:proofErr w:type="spellStart"/>
+      <w:r>
+        <w:rPr>
+          <w:b/>
+          <w:bCs/>
+          <w:color w:val="D86DCB" w:themeColor="accent5" w:themeTint="99"/>
+          <w:sz w:val="32"/>
+          <w:szCs w:val="32"/>
+        </w:rPr>
+        <w:t>dict</w:t>
+      </w:r>
+      <w:proofErr w:type="spellEnd"/>
+      <w:r>
+        <w:rPr>
+          <w:b/>
+          <w:bCs/>
+          <w:color w:val="D86DCB" w:themeColor="accent5" w:themeTint="99"/>
+          <w:sz w:val="32"/>
+          <w:szCs w:val="32"/>
+        </w:rPr>
+        <w:t>'&gt;</w:t>
+      </w:r>
+    </w:p>
+    <w:p>
+      <w:pPr>
+        <w:spacing w:line="240" w:lineRule="auto"/>
+        <w:jc w:val="both"/>
+        <w:rPr>
+          <w:sz w:val="32"/>
+          <w:szCs w:val="32"/>
+        </w:rPr>
+      </w:pPr>
+      <w:r>
+        <w:rPr>
+          <w:sz w:val="32"/>
+          <w:szCs w:val="32"/>
+        </w:rPr>
+        <w:t># Another example, here we open a JSON file in write mode. Then use the</w:t>
+      </w:r>
+      <w:r>
+        <w:rPr>
+          <w:b/>
+          <w:bCs/>
           <w:sz w:val="32"/>
           <w:szCs w:val="32"/>
         </w:rPr>
         <w:t xml:space="preserve"> </w:t>
       </w:r>
-      <w:r>
-        <w:rPr>
-          <w:b/>
-          <w:bCs/>
-          <w:color w:val="D86DCB" w:themeColor="accent5" w:themeTint="99"/>
-          <w:sz w:val="32"/>
-          <w:szCs w:val="32"/>
-        </w:rPr>
-        <w:t># &lt;class '</w:t>
-      </w:r>
-      <w:proofErr w:type="spellStart"/>
-      <w:r>
-        <w:rPr>
-          <w:b/>
-          <w:bCs/>
-          <w:color w:val="D86DCB" w:themeColor="accent5" w:themeTint="99"/>
-          <w:sz w:val="32"/>
-          <w:szCs w:val="32"/>
-        </w:rPr>
-        <w:t>dict</w:t>
-      </w:r>
-      <w:proofErr w:type="spellEnd"/>
-      <w:r>
-        <w:rPr>
-          <w:b/>
-          <w:bCs/>
-          <w:color w:val="D86DCB" w:themeColor="accent5" w:themeTint="99"/>
-          <w:sz w:val="32"/>
-          <w:szCs w:val="32"/>
-        </w:rPr>
-        <w:t>'&gt;</w:t>
-      </w:r>
-    </w:p>
-    <w:p>
-      <w:pPr>
-        <w:spacing w:line="240" w:lineRule="auto"/>
-        <w:jc w:val="both"/>
-        <w:rPr>
-          <w:b/>
-          <w:bCs/>
-          <w:sz w:val="32"/>
-          <w:szCs w:val="32"/>
-        </w:rPr>
-      </w:pPr>
-    </w:p>
-    <w:p>
-      <w:pPr>
-        <w:spacing w:line="240" w:lineRule="auto"/>
-        <w:jc w:val="both"/>
-        <w:rPr>
-          <w:b/>
-          <w:bCs/>
-          <w:sz w:val="32"/>
-          <w:szCs w:val="32"/>
-        </w:rPr>
-      </w:pPr>
-    </w:p>
-    <w:p>
-      <w:pPr>
-        <w:spacing w:line="240" w:lineRule="auto"/>
-        <w:jc w:val="both"/>
-        <w:rPr>
-          <w:b/>
-          <w:bCs/>
-          <w:sz w:val="32"/>
-          <w:szCs w:val="32"/>
-        </w:rPr>
-      </w:pPr>
-      <w:r>
-        <w:rPr>
-          <w:b/>
-          <w:bCs/>
-          <w:sz w:val="32"/>
-          <w:szCs w:val="32"/>
-        </w:rPr>
-        <w:t>Python Extra Methods (IMPORTANT):</w:t>
-      </w:r>
-    </w:p>
-    <w:p>
-      <w:pPr>
-        <w:spacing w:line="240" w:lineRule="auto"/>
-        <w:jc w:val="both"/>
-        <w:rPr>
-          <w:b/>
-          <w:bCs/>
-          <w:sz w:val="32"/>
-          <w:szCs w:val="32"/>
-        </w:rPr>
-      </w:pPr>
-    </w:p>
-    <w:p>
-      <w:pPr>
-        <w:spacing w:line="240" w:lineRule="auto"/>
-        <w:jc w:val="both"/>
-        <w:rPr>
-          <w:b/>
-          <w:bCs/>
-          <w:sz w:val="32"/>
-          <w:szCs w:val="32"/>
-        </w:rPr>
-      </w:pPr>
       <w:proofErr w:type="spellStart"/>
       <w:proofErr w:type="gramStart"/>
       <w:r>
@@ -37273,18 +37204,9 @@
           <w:sz w:val="32"/>
           <w:szCs w:val="32"/>
         </w:rPr>
-        <w:t>divmod</w:t>
+        <w:t>json.dump</w:t>
       </w:r>
       <w:proofErr w:type="spellEnd"/>
-      <w:r>
-        <w:rPr>
-          <w:b/>
-          <w:bCs/>
-          <w:sz w:val="32"/>
-          <w:szCs w:val="32"/>
-        </w:rPr>
-        <w:t>(</w:t>
-      </w:r>
       <w:proofErr w:type="gramEnd"/>
       <w:r>
         <w:rPr>
@@ -37293,7 +37215,32 @@
           <w:sz w:val="32"/>
           <w:szCs w:val="32"/>
         </w:rPr>
-        <w:t>):</w:t>
+        <w:t>(…, …</w:t>
+      </w:r>
+      <w:r>
+        <w:rPr>
+          <w:b/>
+          <w:bCs/>
+          <w:sz w:val="32"/>
+          <w:szCs w:val="32"/>
+        </w:rPr>
+        <w:t>, …</w:t>
+      </w:r>
+      <w:r>
+        <w:rPr>
+          <w:b/>
+          <w:bCs/>
+          <w:sz w:val="32"/>
+          <w:szCs w:val="32"/>
+        </w:rPr>
+        <w:t>)</w:t>
+      </w:r>
+      <w:r>
+        <w:rPr>
+          <w:sz w:val="32"/>
+          <w:szCs w:val="32"/>
+        </w:rPr>
+        <w:t xml:space="preserve"> method to write the data which is a dictionary, in this JSON file.</w:t>
       </w:r>
     </w:p>
     <w:p>
@@ -37314,10 +37261,19 @@
       </w:r>
       <w:r>
         <w:rPr>
-          <w:sz w:val="32"/>
-          <w:szCs w:val="32"/>
-        </w:rPr>
-        <w:t>It is a super handy built-in Python function that does division + remainder at the same time.</w:t>
+          <w:b/>
+          <w:bCs/>
+          <w:sz w:val="32"/>
+          <w:szCs w:val="32"/>
+        </w:rPr>
+        <w:t>Indent=4</w:t>
+      </w:r>
+      <w:r>
+        <w:rPr>
+          <w:sz w:val="32"/>
+          <w:szCs w:val="32"/>
+        </w:rPr>
+        <w:t xml:space="preserve"> is used to increase readability of the JSON file</w:t>
       </w:r>
     </w:p>
     <w:p>
@@ -37325,16 +37281,295 @@
         <w:spacing w:line="240" w:lineRule="auto"/>
         <w:jc w:val="both"/>
         <w:rPr>
-          <w:sz w:val="32"/>
-          <w:szCs w:val="32"/>
-        </w:rPr>
-      </w:pPr>
-      <w:r>
-        <w:rPr>
-          <w:sz w:val="32"/>
-          <w:szCs w:val="32"/>
-        </w:rPr>
-        <w:t xml:space="preserve"># </w:t>
+          <w:b/>
+          <w:bCs/>
+          <w:color w:val="D86DCB" w:themeColor="accent5" w:themeTint="99"/>
+          <w:sz w:val="32"/>
+          <w:szCs w:val="32"/>
+        </w:rPr>
+      </w:pPr>
+      <w:r>
+        <w:rPr>
+          <w:b/>
+          <w:bCs/>
+          <w:color w:val="D86DCB" w:themeColor="accent5" w:themeTint="99"/>
+          <w:sz w:val="32"/>
+          <w:szCs w:val="32"/>
+        </w:rPr>
+        <w:t xml:space="preserve">import </w:t>
+      </w:r>
+      <w:proofErr w:type="spellStart"/>
+      <w:r>
+        <w:rPr>
+          <w:b/>
+          <w:bCs/>
+          <w:color w:val="D86DCB" w:themeColor="accent5" w:themeTint="99"/>
+          <w:sz w:val="32"/>
+          <w:szCs w:val="32"/>
+        </w:rPr>
+        <w:t>json</w:t>
+      </w:r>
+      <w:proofErr w:type="spellEnd"/>
+    </w:p>
+    <w:p>
+      <w:pPr>
+        <w:spacing w:line="240" w:lineRule="auto"/>
+        <w:jc w:val="both"/>
+        <w:rPr>
+          <w:b/>
+          <w:bCs/>
+          <w:color w:val="D86DCB" w:themeColor="accent5" w:themeTint="99"/>
+          <w:sz w:val="32"/>
+          <w:szCs w:val="32"/>
+        </w:rPr>
+      </w:pPr>
+      <w:r>
+        <w:rPr>
+          <w:b/>
+          <w:bCs/>
+          <w:color w:val="D86DCB" w:themeColor="accent5" w:themeTint="99"/>
+          <w:sz w:val="32"/>
+          <w:szCs w:val="32"/>
+        </w:rPr>
+        <w:t>data = {</w:t>
+      </w:r>
+    </w:p>
+    <w:p>
+      <w:pPr>
+        <w:spacing w:line="240" w:lineRule="auto"/>
+        <w:jc w:val="both"/>
+        <w:rPr>
+          <w:b/>
+          <w:bCs/>
+          <w:color w:val="D86DCB" w:themeColor="accent5" w:themeTint="99"/>
+          <w:sz w:val="32"/>
+          <w:szCs w:val="32"/>
+        </w:rPr>
+      </w:pPr>
+      <w:r>
+        <w:rPr>
+          <w:b/>
+          <w:bCs/>
+          <w:color w:val="D86DCB" w:themeColor="accent5" w:themeTint="99"/>
+          <w:sz w:val="32"/>
+          <w:szCs w:val="32"/>
+        </w:rPr>
+        <w:t xml:space="preserve">    "name</w:t>
+      </w:r>
+      <w:proofErr w:type="gramStart"/>
+      <w:r>
+        <w:rPr>
+          <w:b/>
+          <w:bCs/>
+          <w:color w:val="D86DCB" w:themeColor="accent5" w:themeTint="99"/>
+          <w:sz w:val="32"/>
+          <w:szCs w:val="32"/>
+        </w:rPr>
+        <w:t>" :</w:t>
+      </w:r>
+      <w:proofErr w:type="gramEnd"/>
+      <w:r>
+        <w:rPr>
+          <w:b/>
+          <w:bCs/>
+          <w:color w:val="D86DCB" w:themeColor="accent5" w:themeTint="99"/>
+          <w:sz w:val="32"/>
+          <w:szCs w:val="32"/>
+        </w:rPr>
+        <w:t xml:space="preserve"> "Alice",</w:t>
+      </w:r>
+    </w:p>
+    <w:p>
+      <w:pPr>
+        <w:spacing w:line="240" w:lineRule="auto"/>
+        <w:jc w:val="both"/>
+        <w:rPr>
+          <w:b/>
+          <w:bCs/>
+          <w:color w:val="D86DCB" w:themeColor="accent5" w:themeTint="99"/>
+          <w:sz w:val="32"/>
+          <w:szCs w:val="32"/>
+        </w:rPr>
+      </w:pPr>
+      <w:r>
+        <w:rPr>
+          <w:b/>
+          <w:bCs/>
+          <w:color w:val="D86DCB" w:themeColor="accent5" w:themeTint="99"/>
+          <w:sz w:val="32"/>
+          <w:szCs w:val="32"/>
+        </w:rPr>
+        <w:t xml:space="preserve">    "age</w:t>
+      </w:r>
+      <w:proofErr w:type="gramStart"/>
+      <w:r>
+        <w:rPr>
+          <w:b/>
+          <w:bCs/>
+          <w:color w:val="D86DCB" w:themeColor="accent5" w:themeTint="99"/>
+          <w:sz w:val="32"/>
+          <w:szCs w:val="32"/>
+        </w:rPr>
+        <w:t>" :</w:t>
+      </w:r>
+      <w:proofErr w:type="gramEnd"/>
+      <w:r>
+        <w:rPr>
+          <w:b/>
+          <w:bCs/>
+          <w:color w:val="D86DCB" w:themeColor="accent5" w:themeTint="99"/>
+          <w:sz w:val="32"/>
+          <w:szCs w:val="32"/>
+        </w:rPr>
+        <w:t xml:space="preserve"> 30,</w:t>
+      </w:r>
+    </w:p>
+    <w:p>
+      <w:pPr>
+        <w:spacing w:line="240" w:lineRule="auto"/>
+        <w:jc w:val="both"/>
+        <w:rPr>
+          <w:b/>
+          <w:bCs/>
+          <w:color w:val="D86DCB" w:themeColor="accent5" w:themeTint="99"/>
+          <w:sz w:val="32"/>
+          <w:szCs w:val="32"/>
+        </w:rPr>
+      </w:pPr>
+      <w:r>
+        <w:rPr>
+          <w:b/>
+          <w:bCs/>
+          <w:color w:val="D86DCB" w:themeColor="accent5" w:themeTint="99"/>
+          <w:sz w:val="32"/>
+          <w:szCs w:val="32"/>
+        </w:rPr>
+        <w:t xml:space="preserve">    "</w:t>
+      </w:r>
+      <w:proofErr w:type="spellStart"/>
+      <w:r>
+        <w:rPr>
+          <w:b/>
+          <w:bCs/>
+          <w:color w:val="D86DCB" w:themeColor="accent5" w:themeTint="99"/>
+          <w:sz w:val="32"/>
+          <w:szCs w:val="32"/>
+        </w:rPr>
+        <w:t>is_student</w:t>
+      </w:r>
+      <w:proofErr w:type="spellEnd"/>
+      <w:proofErr w:type="gramStart"/>
+      <w:r>
+        <w:rPr>
+          <w:b/>
+          <w:bCs/>
+          <w:color w:val="D86DCB" w:themeColor="accent5" w:themeTint="99"/>
+          <w:sz w:val="32"/>
+          <w:szCs w:val="32"/>
+        </w:rPr>
+        <w:t>" :</w:t>
+      </w:r>
+      <w:proofErr w:type="gramEnd"/>
+      <w:r>
+        <w:rPr>
+          <w:b/>
+          <w:bCs/>
+          <w:color w:val="D86DCB" w:themeColor="accent5" w:themeTint="99"/>
+          <w:sz w:val="32"/>
+          <w:szCs w:val="32"/>
+        </w:rPr>
+        <w:t xml:space="preserve"> False,</w:t>
+      </w:r>
+    </w:p>
+    <w:p>
+      <w:pPr>
+        <w:spacing w:line="240" w:lineRule="auto"/>
+        <w:jc w:val="both"/>
+        <w:rPr>
+          <w:b/>
+          <w:bCs/>
+          <w:color w:val="D86DCB" w:themeColor="accent5" w:themeTint="99"/>
+          <w:sz w:val="32"/>
+          <w:szCs w:val="32"/>
+        </w:rPr>
+      </w:pPr>
+      <w:r>
+        <w:rPr>
+          <w:b/>
+          <w:bCs/>
+          <w:color w:val="D86DCB" w:themeColor="accent5" w:themeTint="99"/>
+          <w:sz w:val="32"/>
+          <w:szCs w:val="32"/>
+        </w:rPr>
+        <w:t xml:space="preserve">    "courses</w:t>
+      </w:r>
+      <w:proofErr w:type="gramStart"/>
+      <w:r>
+        <w:rPr>
+          <w:b/>
+          <w:bCs/>
+          <w:color w:val="D86DCB" w:themeColor="accent5" w:themeTint="99"/>
+          <w:sz w:val="32"/>
+          <w:szCs w:val="32"/>
+        </w:rPr>
+        <w:t>" :</w:t>
+      </w:r>
+      <w:proofErr w:type="gramEnd"/>
+      <w:r>
+        <w:rPr>
+          <w:b/>
+          <w:bCs/>
+          <w:color w:val="D86DCB" w:themeColor="accent5" w:themeTint="99"/>
+          <w:sz w:val="32"/>
+          <w:szCs w:val="32"/>
+        </w:rPr>
+        <w:t xml:space="preserve"> ["History", "Math"]</w:t>
+      </w:r>
+    </w:p>
+    <w:p>
+      <w:pPr>
+        <w:spacing w:line="240" w:lineRule="auto"/>
+        <w:jc w:val="both"/>
+        <w:rPr>
+          <w:b/>
+          <w:bCs/>
+          <w:color w:val="D86DCB" w:themeColor="accent5" w:themeTint="99"/>
+          <w:sz w:val="32"/>
+          <w:szCs w:val="32"/>
+        </w:rPr>
+      </w:pPr>
+      <w:r>
+        <w:rPr>
+          <w:b/>
+          <w:bCs/>
+          <w:color w:val="D86DCB" w:themeColor="accent5" w:themeTint="99"/>
+          <w:sz w:val="32"/>
+          <w:szCs w:val="32"/>
+        </w:rPr>
+        <w:t>}</w:t>
+      </w:r>
+    </w:p>
+    <w:p>
+      <w:pPr>
+        <w:spacing w:line="240" w:lineRule="auto"/>
+        <w:jc w:val="both"/>
+        <w:rPr>
+          <w:b/>
+          <w:bCs/>
+          <w:color w:val="D86DCB" w:themeColor="accent5" w:themeTint="99"/>
+          <w:sz w:val="32"/>
+          <w:szCs w:val="32"/>
+        </w:rPr>
+      </w:pPr>
+      <w:r>
+        <w:rPr>
+          <w:b/>
+          <w:bCs/>
+          <w:color w:val="D86DCB" w:themeColor="accent5" w:themeTint="99"/>
+          <w:sz w:val="32"/>
+          <w:szCs w:val="32"/>
+        </w:rPr>
+        <w:t>with open ('</w:t>
       </w:r>
       <w:proofErr w:type="spellStart"/>
       <w:proofErr w:type="gramStart"/>
@@ -37342,6 +37577,146 @@
         <w:rPr>
           <w:b/>
           <w:bCs/>
+          <w:color w:val="D86DCB" w:themeColor="accent5" w:themeTint="99"/>
+          <w:sz w:val="32"/>
+          <w:szCs w:val="32"/>
+        </w:rPr>
+        <w:t>data.json</w:t>
+      </w:r>
+      <w:proofErr w:type="spellEnd"/>
+      <w:proofErr w:type="gramEnd"/>
+      <w:r>
+        <w:rPr>
+          <w:b/>
+          <w:bCs/>
+          <w:color w:val="D86DCB" w:themeColor="accent5" w:themeTint="99"/>
+          <w:sz w:val="32"/>
+          <w:szCs w:val="32"/>
+        </w:rPr>
+        <w:t>', 'w') as f:</w:t>
+      </w:r>
+    </w:p>
+    <w:p>
+      <w:pPr>
+        <w:spacing w:line="240" w:lineRule="auto"/>
+        <w:jc w:val="both"/>
+        <w:rPr>
+          <w:b/>
+          <w:bCs/>
+          <w:color w:val="D86DCB" w:themeColor="accent5" w:themeTint="99"/>
+          <w:sz w:val="32"/>
+          <w:szCs w:val="32"/>
+        </w:rPr>
+      </w:pPr>
+      <w:r>
+        <w:rPr>
+          <w:b/>
+          <w:bCs/>
+          <w:color w:val="D86DCB" w:themeColor="accent5" w:themeTint="99"/>
+          <w:sz w:val="32"/>
+          <w:szCs w:val="32"/>
+        </w:rPr>
+        <w:t xml:space="preserve">    </w:t>
+      </w:r>
+      <w:proofErr w:type="spellStart"/>
+      <w:proofErr w:type="gramStart"/>
+      <w:r>
+        <w:rPr>
+          <w:b/>
+          <w:bCs/>
+          <w:color w:val="D86DCB" w:themeColor="accent5" w:themeTint="99"/>
+          <w:sz w:val="32"/>
+          <w:szCs w:val="32"/>
+        </w:rPr>
+        <w:t>json.dump</w:t>
+      </w:r>
+      <w:proofErr w:type="spellEnd"/>
+      <w:proofErr w:type="gramEnd"/>
+      <w:r>
+        <w:rPr>
+          <w:b/>
+          <w:bCs/>
+          <w:color w:val="D86DCB" w:themeColor="accent5" w:themeTint="99"/>
+          <w:sz w:val="32"/>
+          <w:szCs w:val="32"/>
+        </w:rPr>
+        <w:t>(data, f, indent=4)</w:t>
+      </w:r>
+    </w:p>
+    <w:p>
+      <w:pPr>
+        <w:spacing w:line="240" w:lineRule="auto"/>
+        <w:jc w:val="both"/>
+        <w:rPr>
+          <w:b/>
+          <w:bCs/>
+          <w:sz w:val="32"/>
+          <w:szCs w:val="32"/>
+        </w:rPr>
+      </w:pPr>
+    </w:p>
+    <w:p>
+      <w:pPr>
+        <w:spacing w:line="240" w:lineRule="auto"/>
+        <w:jc w:val="both"/>
+        <w:rPr>
+          <w:b/>
+          <w:bCs/>
+          <w:sz w:val="32"/>
+          <w:szCs w:val="32"/>
+        </w:rPr>
+      </w:pPr>
+    </w:p>
+    <w:p>
+      <w:pPr>
+        <w:spacing w:line="240" w:lineRule="auto"/>
+        <w:jc w:val="both"/>
+        <w:rPr>
+          <w:b/>
+          <w:bCs/>
+          <w:sz w:val="32"/>
+          <w:szCs w:val="32"/>
+        </w:rPr>
+      </w:pPr>
+      <w:r>
+        <w:rPr>
+          <w:b/>
+          <w:bCs/>
+          <w:sz w:val="32"/>
+          <w:szCs w:val="32"/>
+        </w:rPr>
+        <w:t>Python Extra Methods (IMPORTANT):</w:t>
+      </w:r>
+    </w:p>
+    <w:p>
+      <w:pPr>
+        <w:spacing w:line="240" w:lineRule="auto"/>
+        <w:jc w:val="both"/>
+        <w:rPr>
+          <w:b/>
+          <w:bCs/>
+          <w:sz w:val="32"/>
+          <w:szCs w:val="32"/>
+        </w:rPr>
+      </w:pPr>
+    </w:p>
+    <w:p>
+      <w:pPr>
+        <w:spacing w:line="240" w:lineRule="auto"/>
+        <w:jc w:val="both"/>
+        <w:rPr>
+          <w:b/>
+          <w:bCs/>
+          <w:sz w:val="32"/>
+          <w:szCs w:val="32"/>
+        </w:rPr>
+      </w:pPr>
+      <w:proofErr w:type="spellStart"/>
+      <w:proofErr w:type="gramStart"/>
+      <w:r>
+        <w:rPr>
+          <w:b/>
+          <w:bCs/>
           <w:sz w:val="32"/>
           <w:szCs w:val="32"/>
         </w:rPr>
@@ -37365,6 +37740,78 @@
           <w:sz w:val="32"/>
           <w:szCs w:val="32"/>
         </w:rPr>
+        <w:t>):</w:t>
+      </w:r>
+    </w:p>
+    <w:p>
+      <w:pPr>
+        <w:spacing w:line="240" w:lineRule="auto"/>
+        <w:jc w:val="both"/>
+        <w:rPr>
+          <w:sz w:val="32"/>
+          <w:szCs w:val="32"/>
+        </w:rPr>
+      </w:pPr>
+      <w:r>
+        <w:rPr>
+          <w:sz w:val="32"/>
+          <w:szCs w:val="32"/>
+        </w:rPr>
+        <w:t xml:space="preserve"># </w:t>
+      </w:r>
+      <w:r>
+        <w:rPr>
+          <w:sz w:val="32"/>
+          <w:szCs w:val="32"/>
+        </w:rPr>
+        <w:t>It is a super handy built-in Python function that does division + remainder at the same time.</w:t>
+      </w:r>
+    </w:p>
+    <w:p>
+      <w:pPr>
+        <w:spacing w:line="240" w:lineRule="auto"/>
+        <w:jc w:val="both"/>
+        <w:rPr>
+          <w:sz w:val="32"/>
+          <w:szCs w:val="32"/>
+        </w:rPr>
+      </w:pPr>
+      <w:r>
+        <w:rPr>
+          <w:sz w:val="32"/>
+          <w:szCs w:val="32"/>
+        </w:rPr>
+        <w:t xml:space="preserve"># </w:t>
+      </w:r>
+      <w:proofErr w:type="spellStart"/>
+      <w:proofErr w:type="gramStart"/>
+      <w:r>
+        <w:rPr>
+          <w:b/>
+          <w:bCs/>
+          <w:sz w:val="32"/>
+          <w:szCs w:val="32"/>
+        </w:rPr>
+        <w:t>divmod</w:t>
+      </w:r>
+      <w:proofErr w:type="spellEnd"/>
+      <w:r>
+        <w:rPr>
+          <w:b/>
+          <w:bCs/>
+          <w:sz w:val="32"/>
+          <w:szCs w:val="32"/>
+        </w:rPr>
+        <w:t>(</w:t>
+      </w:r>
+      <w:proofErr w:type="gramEnd"/>
+      <w:r>
+        <w:rPr>
+          <w:b/>
+          <w:bCs/>
+          <w:sz w:val="32"/>
+          <w:szCs w:val="32"/>
+        </w:rPr>
         <w:t>a, b)</w:t>
       </w:r>
       <w:r>
@@ -37464,6 +37911,7 @@
           <w:sz w:val="32"/>
           <w:szCs w:val="32"/>
         </w:rPr>
+        <w:lastRenderedPageBreak/>
         <w:t xml:space="preserve"># Example, </w:t>
       </w:r>
       <w:r>
@@ -38053,7 +38501,6 @@
           <w:sz w:val="32"/>
           <w:szCs w:val="32"/>
         </w:rPr>
-        <w:lastRenderedPageBreak/>
         <w:t>print(</w:t>
       </w:r>
       <w:proofErr w:type="spellStart"/>

</xml_diff>